<commit_message>
Add new chapter engines
</commit_message>
<xml_diff>
--- a/old/SRW.docx
+++ b/old/SRW.docx
@@ -1131,7 +1131,21 @@
             <w:rStyle w:val="ad"/>
             <w:noProof/>
           </w:rPr>
-          <w:t>Движок</w:t>
+          <w:t>Движ</w:t>
+        </w:r>
+        <w:r>
+          <w:rPr>
+            <w:rStyle w:val="ad"/>
+            <w:noProof/>
+          </w:rPr>
+          <w:t>о</w:t>
+        </w:r>
+        <w:r>
+          <w:rPr>
+            <w:rStyle w:val="ad"/>
+            <w:noProof/>
+          </w:rPr>
+          <w:t>к</w:t>
         </w:r>
         <w:r>
           <w:rPr>
@@ -1773,15 +1787,11 @@
         <w:pStyle w:val="11"/>
         <w:rPr>
           <w:rFonts w:eastAsiaTheme="minorHAnsi"/>
-          <w:b w:val="0"/>
-          <w:bCs w:val="0"/>
         </w:rPr>
       </w:pPr>
       <w:r>
         <w:rPr>
           <w:rFonts w:eastAsiaTheme="minorHAnsi"/>
-          <w:b w:val="0"/>
-          <w:bCs w:val="0"/>
         </w:rPr>
         <w:fldChar w:fldCharType="end"/>
       </w:r>
@@ -4591,7 +4601,7 @@
           <w:noProof/>
         </w:rPr>
         <w:drawing>
-          <wp:inline distT="0" distB="0" distL="0" distR="0" wp14:anchorId="752D9886" wp14:editId="2C1708AA">
+          <wp:inline distT="0" distB="0" distL="0" distR="0" wp14:anchorId="752D9886" wp14:editId="7FCDDCC2">
             <wp:extent cx="1789043" cy="1789043"/>
             <wp:effectExtent l="0" t="0" r="0" b="0"/>
             <wp:docPr id="1063245774" name="Рисунок 1"/>
@@ -13709,7 +13719,7 @@
     <w:basedOn w:val="1"/>
     <w:autoRedefine/>
     <w:qFormat/>
-    <w:rsid w:val="00F75BDA"/>
+    <w:rsid w:val="00D03011"/>
     <w:pPr>
       <w:spacing w:line="480" w:lineRule="auto"/>
       <w:jc w:val="center"/>

</xml_diff>